<commit_message>
Buchungen vom Vortag kopieren, Übliche Arbeitstage festlegen
Buchungen vom Vortag kopieren
Übliche Arbeitstage festlegen
</commit_message>
<xml_diff>
--- a/Benutzeranleitung-Stundenzettel.docx
+++ b/Benutzeranleitung-Stundenzettel.docx
@@ -1437,6 +1437,245 @@
         <w:t>Prüfe zuerst Datum, Projekt und Uhrzeiten. Bitte danach die zuständige Ansprechperson um Hilfe, bevor du eine falsche Monatsübersicht verschickst.</w:t>
       </w:r>
     </w:p>
+    <w:p>
+      <w:r>
+        <w:br w:type="page"/>
+      </w:r>
+    </w:p>
+    <w:p>
+      <w:pPr>
+        <w:pStyle w:val="Heading1"/>
+      </w:pPr>
+      <w:r>
+        <w:t>Buchungen übernehmen und Arbeitstage prüfen</w:t>
+      </w:r>
+    </w:p>
+    <w:p>
+      <w:pPr>
+        <w:spacing w:after="200"/>
+      </w:pPr>
+      <w:r>
+        <w:t>Diese Seite erklärt zwei zusätzliche Funktionen der App. Beide helfen dir, Einträge schneller zu erfassen und fehlende Angaben im Monat zu entdecken.</w:t>
+      </w:r>
+    </w:p>
+    <w:p>
+      <w:pPr>
+        <w:pStyle w:val="Heading2"/>
+      </w:pPr>
+      <w:r>
+        <w:t>Buchungen vom Vortag kopieren</w:t>
+      </w:r>
+    </w:p>
+    <w:p>
+      <w:pPr>
+        <w:spacing w:after="100"/>
+        <w:ind w:left="200" w:hanging="200"/>
+      </w:pPr>
+      <w:r>
+        <w:rPr>
+          <w:b/>
+          <w:color w:val="134E4A"/>
+        </w:rPr>
+        <w:t xml:space="preserve">1. </w:t>
+      </w:r>
+      <w:r>
+        <w:t>Wähle im Kalender den Tag aus, für den du die Zeiten eintragen möchtest.</w:t>
+      </w:r>
+    </w:p>
+    <w:p>
+      <w:pPr>
+        <w:spacing w:after="100"/>
+        <w:ind w:left="200" w:hanging="200"/>
+      </w:pPr>
+      <w:r>
+        <w:rPr>
+          <w:b/>
+          <w:color w:val="134E4A"/>
+        </w:rPr>
+        <w:t xml:space="preserve">2. </w:t>
+      </w:r>
+      <w:r>
+        <w:t>Wenn am Vortag mindestens eine Buchung gespeichert ist, erscheint „Buchungen vom Vortag kopieren“. Tippe auf diese Schaltfläche.</w:t>
+      </w:r>
+    </w:p>
+    <w:p>
+      <w:pPr>
+        <w:spacing w:after="100"/>
+        <w:ind w:left="200" w:hanging="200"/>
+      </w:pPr>
+      <w:r>
+        <w:rPr>
+          <w:b/>
+          <w:color w:val="134E4A"/>
+        </w:rPr>
+        <w:t xml:space="preserve">3. </w:t>
+      </w:r>
+      <w:r>
+        <w:t>Die Buchungen des Vortags werden mit denselben Projekten, Uhrzeiten und Pausen zum ausgewählten Tag hinzugefügt. Wenn dort bereits Buchungen stehen, fragt die App vorher nach. Bestehende Buchungen bleiben erhalten.</w:t>
+      </w:r>
+    </w:p>
+    <w:p>
+      <w:pPr>
+        <w:spacing w:after="100"/>
+        <w:ind w:left="200" w:hanging="200"/>
+      </w:pPr>
+      <w:r>
+        <w:rPr>
+          <w:b/>
+          <w:color w:val="134E4A"/>
+        </w:rPr>
+        <w:t xml:space="preserve">4. </w:t>
+      </w:r>
+      <w:r>
+        <w:t>Prüfe jede übernommene Buchung. Passe Projekt, Beginn, Ende und Pause an den ausgewählten Tag an. Lösche Buchungen, die du nicht brauchst.</w:t>
+      </w:r>
+    </w:p>
+    <w:tbl>
+      <w:tblPr>
+        <w:tblW w:type="auto" w:w="0"/>
+        <w:jc w:val="center"/>
+        <w:tblLayout w:type="fixed"/>
+        <w:tblLook w:firstColumn="1" w:firstRow="1" w:lastColumn="0" w:lastRow="0" w:noHBand="0" w:noVBand="1" w:val="04A0"/>
+      </w:tblPr>
+      <w:tblGrid>
+        <w:gridCol w:w="9600"/>
+      </w:tblGrid>
+      <w:tr>
+        <w:tc>
+          <w:tcPr>
+            <w:tcW w:type="dxa" w:w="9600"/>
+            <w:vAlign w:val="center"/>
+            <w:shd w:fill="E8F3F1"/>
+          </w:tcPr>
+          <w:p>
+            <w:pPr>
+              <w:spacing w:before="80" w:after="80"/>
+            </w:pPr>
+            <w:r>
+              <w:rPr>
+                <w:b/>
+                <w:color w:val="134E4A"/>
+              </w:rPr>
+              <w:t xml:space="preserve">Wichtig  </w:t>
+            </w:r>
+            <w:r>
+              <w:t>Die Zeiten werden unverändert kopiert. Wenn du an den beiden Tagen zu anderen Zeiten gearbeitet hast, ändere sie nach dem Kopieren.</w:t>
+            </w:r>
+          </w:p>
+        </w:tc>
+      </w:tr>
+    </w:tbl>
+    <w:p>
+      <w:pPr>
+        <w:spacing w:after="0"/>
+      </w:pPr>
+    </w:p>
+    <w:p>
+      <w:pPr>
+        <w:pStyle w:val="Heading2"/>
+      </w:pPr>
+      <w:r>
+        <w:t>Übliche Arbeitstage festlegen</w:t>
+      </w:r>
+    </w:p>
+    <w:p>
+      <w:pPr>
+        <w:spacing w:after="100"/>
+        <w:ind w:left="200" w:hanging="200"/>
+      </w:pPr>
+      <w:r>
+        <w:rPr>
+          <w:b/>
+          <w:color w:val="134E4A"/>
+        </w:rPr>
+        <w:t xml:space="preserve">1. </w:t>
+      </w:r>
+      <w:r>
+        <w:t>Öffne oben rechts das Menü ☰ und tippe auf „Adminbereich“.</w:t>
+      </w:r>
+    </w:p>
+    <w:p>
+      <w:pPr>
+        <w:spacing w:after="100"/>
+        <w:ind w:left="200" w:hanging="200"/>
+      </w:pPr>
+      <w:r>
+        <w:rPr>
+          <w:b/>
+          <w:color w:val="134E4A"/>
+        </w:rPr>
+        <w:t xml:space="preserve">2. </w:t>
+      </w:r>
+      <w:r>
+        <w:t>Wähle unter „Übliche Arbeitstage“ deine normalen Wochentage aus. Du kannst auch Samstag oder Sonntag auswählen. Wenn deine Arbeitstage jede Woche wechseln, lass die Auswahl leer.</w:t>
+      </w:r>
+    </w:p>
+    <w:p>
+      <w:pPr>
+        <w:spacing w:after="100"/>
+        <w:ind w:left="200" w:hanging="200"/>
+      </w:pPr>
+      <w:r>
+        <w:rPr>
+          <w:b/>
+          <w:color w:val="134E4A"/>
+        </w:rPr>
+        <w:t xml:space="preserve">3. </w:t>
+      </w:r>
+      <w:r>
+        <w:t>Tippe auf „Speichern“. Die Auswahl bleibt auf diesem Gerät und in diesem Browser erhalten.</w:t>
+      </w:r>
+    </w:p>
+    <w:p>
+      <w:pPr>
+        <w:spacing w:before="120"/>
+      </w:pPr>
+      <w:r>
+        <w:rPr>
+          <w:b/>
+          <w:color w:val="134E4A"/>
+        </w:rPr>
+        <w:t xml:space="preserve">Was prüft die App?  </w:t>
+      </w:r>
+      <w:r>
+        <w:t>Bei ausgewählten Wochentagen weist die Monatsprüfung auf vergangene Tage ohne Buchung und ohne Abwesenheitsstatus hin. Der heutige und zukünftige Tage werden noch nicht als fehlend gemeldet. Ein Hinweis ist eine Erinnerung; vor dem Senden kannst du die Angaben prüfen oder trotzdem fortfahren.</w:t>
+      </w:r>
+    </w:p>
+    <w:tbl>
+      <w:tblPr>
+        <w:tblW w:type="auto" w:w="0"/>
+        <w:jc w:val="center"/>
+        <w:tblLayout w:type="fixed"/>
+        <w:tblLook w:firstColumn="1" w:firstRow="1" w:lastColumn="0" w:lastRow="0" w:noHBand="0" w:noVBand="1" w:val="04A0"/>
+      </w:tblPr>
+      <w:tblGrid>
+        <w:gridCol w:w="9600"/>
+      </w:tblGrid>
+      <w:tr>
+        <w:tc>
+          <w:tcPr>
+            <w:tcW w:type="dxa" w:w="9600"/>
+            <w:vAlign w:val="center"/>
+            <w:shd w:fill="FFF4D6"/>
+          </w:tcPr>
+          <w:p>
+            <w:pPr>
+              <w:spacing w:before="80" w:after="80"/>
+            </w:pPr>
+            <w:r>
+              <w:rPr>
+                <w:b/>
+                <w:color w:val="134E4A"/>
+              </w:rPr>
+              <w:t xml:space="preserve">Bei Urlaub oder Krankheit  </w:t>
+            </w:r>
+            <w:r>
+              <w:t>Trage am betreffenden Tag den passenden Status ein. Dann meldet die Monatsprüfung diesen Tag nicht als fehlenden Arbeitseintrag.</w:t>
+            </w:r>
+          </w:p>
+        </w:tc>
+      </w:tr>
+    </w:tbl>
     <w:sectPr>
       <w:headerReference w:type="default" r:id="rId9"/>
       <w:footerReference w:type="default" r:id="rId10"/>

</xml_diff>

<commit_message>
Eingabe per Sprache rausgenommen
</commit_message>
<xml_diff>
--- a/Benutzeranleitung-Stundenzettel.docx
+++ b/Benutzeranleitung-Stundenzettel.docx
@@ -1676,56 +1676,6 @@
         </w:tc>
       </w:tr>
     </w:tbl>
-    <w:p>
-      <w:pPr>
-        <w:pStyle w:val="Heading1"/>
-      </w:pPr>
-      <w:r>
-        <w:t>Arbeitszeiten per Sprache erfassen</w:t>
-      </w:r>
-    </w:p>
-    <w:p>
-      <w:pPr/>
-      <w:r>
-        <w:t>Du kannst Arbeitszeiten und Projekte auch sprechen. Die App zeigt die erkannten Angaben zuerst als Entwurf. Gespeichert wird erst, wenn du die Buchungen ausdrücklich übernimmst.</w:t>
-      </w:r>
-    </w:p>
-    <w:p>
-      <w:pPr/>
-      <w:r>
-        <w:t>1. Wähle im Kalender den Tag aus und tippe auf „Mit Sprache erfassen“.</w:t>
-      </w:r>
-    </w:p>
-    <w:p>
-      <w:pPr/>
-      <w:r>
-        <w:t>2. Tippe auf „Aufnahme starten“. Sprich jede Buchung mit Uhrzeit, Projekt und gegebenenfalls Pause, zum Beispiel: „Von 08:00 bis 11:30 Projekt Büro Nord, 15 Minuten Pause.“</w:t>
-      </w:r>
-    </w:p>
-    <w:p>
-      <w:pPr/>
-      <w:r>
-        <w:t>3. Tippe auf „Aufnahme stoppen“. Prüfe den erkannten Text. Du kannst ihn direkt bearbeiten. Falls die Aufnahme nicht verfügbar ist, kannst du Text eingeben oder die Diktierfunktion der Bildschirmtastatur verwenden.</w:t>
-      </w:r>
-    </w:p>
-    <w:p>
-      <w:pPr/>
-      <w:r>
-        <w:t>4. Tippe auf „Buchungen erkennen“. Kontrolliere in der Vorschau jede Uhrzeit, das Projekt und die Pause. Ergänze fehlende Angaben oder korrigiere Fehler.</w:t>
-      </w:r>
-    </w:p>
-    <w:p>
-      <w:pPr/>
-      <w:r>
-        <w:t>5. Tippe auf „Buchungen übernehmen“, wenn alles stimmt. Erst dann werden die Buchungen zum ausgewählten Tag hinzugefügt.</w:t>
-      </w:r>
-    </w:p>
-    <w:p>
-      <w:pPr/>
-      <w:r>
-        <w:t>Hinweis: Die Spracherkennung hängt vom Browser und der Internetverbindung ab. Je nach Browser kann die Stimme über einen Online-Dienst verarbeitet werden. Prüfe die Vorschau sorgfältig.</w:t>
-      </w:r>
-    </w:p>
     <w:sectPr>
       <w:headerReference w:type="default" r:id="rId9"/>
       <w:footerReference w:type="default" r:id="rId10"/>

</xml_diff>